<commit_message>
Ajustes de repo 2
</commit_message>
<xml_diff>
--- a/fuentes/124108_CF05_DU.docx
+++ b/fuentes/124108_CF05_DU.docx
@@ -14651,8 +14651,8 @@
 </file>
 
 <file path=customXml/item2.xml><?xml version="1.0" encoding="utf-8"?>
-<ct:contentTypeSchema xmlns:ct="http://schemas.microsoft.com/office/2006/metadata/contentType" xmlns:ma="http://schemas.microsoft.com/office/2006/metadata/properties/metaAttributes" ct:_="" ma:_="" ma:contentTypeName="Documento" ma:contentTypeID="0x01010005252A1EF3BD024F856B47B579AB5244" ma:contentTypeVersion="11" ma:contentTypeDescription="Crear nuevo documento." ma:contentTypeScope="" ma:versionID="92b81066167b779aaeee7a3d91bad2fd">
-  <xsd:schema xmlns:xsd="http://www.w3.org/2001/XMLSchema" xmlns:xs="http://www.w3.org/2001/XMLSchema" xmlns:p="http://schemas.microsoft.com/office/2006/metadata/properties" xmlns:ns2="42760c81-fd8e-4d59-8953-7cdb9f38b14f" xmlns:ns3="67a0edcd-0de5-43ed-8c27-e32f38a00c91" targetNamespace="http://schemas.microsoft.com/office/2006/metadata/properties" ma:root="true" ma:fieldsID="83cd6766d967e870b9368cac1ade74e6" ns2:_="" ns3:_="">
+<ct:contentTypeSchema xmlns:ct="http://schemas.microsoft.com/office/2006/metadata/contentType" xmlns:ma="http://schemas.microsoft.com/office/2006/metadata/properties/metaAttributes" ct:_="" ma:_="" ma:contentTypeName="Documento" ma:contentTypeID="0x01010005252A1EF3BD024F856B47B579AB5244" ma:contentTypeVersion="12" ma:contentTypeDescription="Crear nuevo documento." ma:contentTypeScope="" ma:versionID="32d0e18b85ac20c34eab62df21c0cf58">
+  <xsd:schema xmlns:xsd="http://www.w3.org/2001/XMLSchema" xmlns:xs="http://www.w3.org/2001/XMLSchema" xmlns:p="http://schemas.microsoft.com/office/2006/metadata/properties" xmlns:ns2="42760c81-fd8e-4d59-8953-7cdb9f38b14f" xmlns:ns3="67a0edcd-0de5-43ed-8c27-e32f38a00c91" targetNamespace="http://schemas.microsoft.com/office/2006/metadata/properties" ma:root="true" ma:fieldsID="cc2c149e99f10870fd5bc3964e5386d3" ns2:_="" ns3:_="">
     <xsd:import namespace="42760c81-fd8e-4d59-8953-7cdb9f38b14f"/>
     <xsd:import namespace="67a0edcd-0de5-43ed-8c27-e32f38a00c91"/>
     <xsd:element name="properties">
@@ -14671,6 +14671,7 @@
                 <xsd:element ref="ns2:lcf76f155ced4ddcb4097134ff3c332f" minOccurs="0"/>
                 <xsd:element ref="ns3:TaxCatchAll" minOccurs="0"/>
                 <xsd:element ref="ns2:MediaServiceOCR" minOccurs="0"/>
+                <xsd:element ref="ns2:MediaServiceLocation" minOccurs="0"/>
               </xsd:all>
             </xsd:complexType>
           </xsd:element>
@@ -14728,6 +14729,11 @@
         <xsd:restriction base="dms:Note">
           <xsd:maxLength value="255"/>
         </xsd:restriction>
+      </xsd:simpleType>
+    </xsd:element>
+    <xsd:element name="MediaServiceLocation" ma:index="19" nillable="true" ma:displayName="Location" ma:description="" ma:indexed="true" ma:internalName="MediaServiceLocation" ma:readOnly="true">
+      <xsd:simpleType>
+        <xsd:restriction base="dms:Text"/>
       </xsd:simpleType>
     </xsd:element>
   </xsd:schema>
@@ -14874,7 +14880,7 @@
 </file>
 
 <file path=customXml/itemProps2.xml><?xml version="1.0" encoding="utf-8"?>
-<ds:datastoreItem xmlns:ds="http://schemas.openxmlformats.org/officeDocument/2006/customXml" ds:itemID="{9E340B10-D392-4115-BA0C-10320DC5B4DE}"/>
+<ds:datastoreItem xmlns:ds="http://schemas.openxmlformats.org/officeDocument/2006/customXml" ds:itemID="{87D37D60-2F9B-41D4-B733-8D3FEAECE356}"/>
 </file>
 
 <file path=customXml/itemProps3.xml><?xml version="1.0" encoding="utf-8"?>

</xml_diff>